<commit_message>
FULL REMAP AND REINSTALL
</commit_message>
<xml_diff>
--- a/.docx/bUQxTVhCUjh3NzlRdC96cXJyTUkxelk0NDBLMlh3V2RvbmUvN0lJSVdoVT0=20250724081533/LAPORAN PROJECT WORK.docx
+++ b/.docx/bUQxTVhCUjh3NzlRdC96cXJyTUkxelk0NDBLMlh3V2RvbmUvN0lJSVdoVT0=20250724081533/LAPORAN PROJECT WORK.docx
@@ -100,7 +100,7 @@
           <w:noProof/>
         </w:rPr>
         <w:drawing>
-          <wp:anchor distT="0" distB="0" distL="114300" distR="114300" simplePos="0" relativeHeight="251631615" behindDoc="1" locked="0" layoutInCell="1" allowOverlap="1" wp14:anchorId="3A59A508" wp14:editId="7A7D0DD5">
+          <wp:anchor distT="0" distB="0" distL="114300" distR="114300" simplePos="0" relativeHeight="251631615" behindDoc="1" locked="0" layoutInCell="1" allowOverlap="1" wp14:anchorId="3A59A508" wp14:editId="12CD62B4">
             <wp:simplePos x="0" y="0"/>
             <wp:positionH relativeFrom="column">
               <wp:posOffset>-241372</wp:posOffset>
@@ -17019,41 +17019,21 @@
     <w:p/>
     <w:p>
       <w:pPr>
-        <w:pStyle w:val="Heading3"/>
-        <w:rPr>
-          <w:rFonts w:cstheme="minorHAnsi"/>
-          <w:szCs w:val="22"/>
-        </w:rPr>
-      </w:pPr>
-      <w:r>
-        <w:rPr>
-          <w:rFonts w:cstheme="minorHAnsi"/>
-          <w:szCs w:val="22"/>
-        </w:rPr>
+        <w:pStyle w:val="Heading2"/>
+      </w:pPr>
+      <w:r>
         <w:t xml:space="preserve">1.7 </w:t>
       </w:r>
       <w:proofErr w:type="spellStart"/>
       <w:r>
-        <w:rPr>
-          <w:rFonts w:cstheme="minorHAnsi"/>
-          <w:szCs w:val="22"/>
-        </w:rPr>
         <w:t>Rencana</w:t>
       </w:r>
       <w:proofErr w:type="spellEnd"/>
       <w:r>
-        <w:rPr>
-          <w:rFonts w:cstheme="minorHAnsi"/>
-          <w:szCs w:val="22"/>
-        </w:rPr>
-        <w:t xml:space="preserve"> </w:t>
-      </w:r>
-      <w:proofErr w:type="spellStart"/>
-      <w:r>
-        <w:rPr>
-          <w:rFonts w:cstheme="minorHAnsi"/>
-          <w:szCs w:val="22"/>
-        </w:rPr>
+        <w:t xml:space="preserve"> </w:t>
+      </w:r>
+      <w:proofErr w:type="spellStart"/>
+      <w:r>
         <w:t>Kegiatan</w:t>
       </w:r>
       <w:proofErr w:type="spellEnd"/>
@@ -17153,7 +17133,7 @@
           <w:noProof/>
         </w:rPr>
         <w:drawing>
-          <wp:inline distT="0" distB="0" distL="0" distR="0" wp14:anchorId="26C7928E" wp14:editId="22F05F19">
+          <wp:inline distT="0" distB="0" distL="0" distR="0" wp14:anchorId="26C7928E" wp14:editId="39587D58">
             <wp:extent cx="3465899" cy="2465070"/>
             <wp:effectExtent l="0" t="0" r="1270" b="0"/>
             <wp:docPr id="1" name="Picture 1"/>
@@ -17292,7 +17272,7 @@
           <w:noProof/>
         </w:rPr>
         <w:drawing>
-          <wp:inline distT="0" distB="0" distL="0" distR="0" wp14:anchorId="1F252343" wp14:editId="21D9286B">
+          <wp:inline distT="0" distB="0" distL="0" distR="0" wp14:anchorId="1F252343" wp14:editId="428D1481">
             <wp:extent cx="1724025" cy="932082"/>
             <wp:effectExtent l="0" t="0" r="0" b="1905"/>
             <wp:docPr id="2" name="Picture 2"/>
@@ -20676,9 +20656,20 @@
     </w:p>
     <w:p>
       <w:pPr>
+        <w:spacing w:before="100" w:beforeAutospacing="1" w:after="100" w:afterAutospacing="1" w:line="360" w:lineRule="auto"/>
+        <w:ind w:firstLine="720"/>
+        <w:jc w:val="both"/>
+        <w:rPr>
+          <w:rFonts w:eastAsia="Times New Roman" w:cstheme="minorHAnsi"/>
+          <w:lang w:val="en-ID" w:eastAsia="en-ID"/>
+        </w:rPr>
+      </w:pPr>
+    </w:p>
+    <w:p>
+      <w:pPr>
         <w:pStyle w:val="Heading2"/>
         <w:rPr>
-          <w:rFonts w:eastAsia="Times New Roman"/>
+          <w:rFonts w:eastAsia="Times New Roman" w:cstheme="minorHAnsi"/>
           <w:lang w:val="en-ID" w:eastAsia="en-ID"/>
         </w:rPr>
       </w:pPr>
@@ -20707,20 +20698,15 @@
     </w:p>
     <w:p>
       <w:pPr>
-        <w:pStyle w:val="Heading2"/>
         <w:jc w:val="center"/>
         <w:rPr>
           <w:rFonts w:eastAsia="Times New Roman" w:cstheme="minorHAnsi"/>
-          <w:szCs w:val="22"/>
-          <w:lang w:val="en-ID" w:eastAsia="en-ID"/>
-        </w:rPr>
-      </w:pPr>
-      <w:r>
-        <w:rPr>
-          <w:rFonts w:eastAsia="Times New Roman" w:cstheme="minorHAnsi"/>
+          <w:lang w:val="en-ID" w:eastAsia="en-ID"/>
+        </w:rPr>
+      </w:pPr>
+      <w:r>
+        <w:rPr>
           <w:noProof/>
-          <w:szCs w:val="22"/>
-          <w:lang w:val="en-ID" w:eastAsia="en-ID"/>
         </w:rPr>
         <w:drawing>
           <wp:inline distT="0" distB="0" distL="0" distR="0" wp14:anchorId="4F8A6579" wp14:editId="389A9B20">
@@ -40923,6 +40909,19 @@
         </w:rPr>
         <w:tab/>
         <w:t>DFD Level 1</w:t>
+      </w:r>
+    </w:p>
+    <w:p>
+      <w:pPr>
+        <w:rPr>
+          <w:lang w:val="en-ID" w:eastAsia="en-ID"/>
+        </w:rPr>
+      </w:pPr>
+      <w:r>
+        <w:rPr>
+          <w:lang w:val="en-ID" w:eastAsia="en-ID"/>
+        </w:rPr>
+        <w:tab/>
       </w:r>
     </w:p>
     <w:sectPr>
@@ -47454,6 +47453,7 @@
   <w:style w:type="character" w:default="1" w:styleId="DefaultParagraphFont">
     <w:name w:val="Default Paragraph Font"/>
     <w:uiPriority w:val="1"/>
+    <w:semiHidden/>
     <w:unhideWhenUsed/>
   </w:style>
   <w:style w:type="table" w:default="1" w:styleId="TableNormal">

</xml_diff>